<commit_message>
docs: record the resource optimisation (SRAM 81.8% -> 38.2%) in the project intro
Signed-off-by: DingXu-hub <clonemeoutkm@gmail.com>
</commit_message>
<xml_diff>
--- a/作品介绍_contest2026_192_DX.docx
+++ b/作品介绍_contest2026_192_DX.docx
@@ -1943,6 +1943,121 @@
           </w:p>
         </w:tc>
       </w:tr>
+      <w:tr>
+        <w:tc>
+          <w:tcPr>
+            <w:tcW w:type="dxa" w:w="4320"/>
+          </w:tcPr>
+          <w:p>
+            <w:r>
+              <w:rPr>
+                <w:sz w:val="19"/>
+              </w:rPr>
+            </w:r>
+            <w:r>
+              <w:rPr>
+                <w:sz w:val="19"/>
+              </w:rPr>
+              <w:t>内存（SRAM 81.8%→38.2%）</w:t>
+            </w:r>
+          </w:p>
+        </w:tc>
+        <w:tc>
+          <w:tcPr>
+            <w:tcW w:type="dxa" w:w="4320"/>
+          </w:tcPr>
+          <w:p>
+            <w:r>
+              <w:rPr>
+                <w:sz w:val="19"/>
+              </w:rPr>
+            </w:r>
+            <w:r>
+              <w:rPr>
+                <w:sz w:val="19"/>
+              </w:rPr>
+              <w:t xml:space="preserve">关闭 </w:t>
+            </w:r>
+            <w:r>
+              <w:rPr>
+                <w:rFonts w:ascii="Consolas" w:hAnsi="Consolas"/>
+                <w:sz w:val="19"/>
+              </w:rPr>
+              <w:t>CONFIG_ALLSYMS</w:t>
+            </w:r>
+            <w:r>
+              <w:rPr>
+                <w:sz w:val="19"/>
+              </w:rPr>
+              <w:t>（符号表 125 KB）、GPX 缓冲 4096→1024 点、航迹环 2048→1024 点；共省 ~228 KB SRAM、~445 KB Flash</w:t>
+            </w:r>
+          </w:p>
+        </w:tc>
+      </w:tr>
+      <w:tr>
+        <w:tc>
+          <w:tcPr>
+            <w:tcW w:type="dxa" w:w="4320"/>
+          </w:tcPr>
+          <w:p>
+            <w:r>
+              <w:rPr>
+                <w:sz w:val="19"/>
+              </w:rPr>
+            </w:r>
+            <w:r>
+              <w:rPr>
+                <w:sz w:val="19"/>
+              </w:rPr>
+              <w:t>运行日志噪声</w:t>
+            </w:r>
+          </w:p>
+        </w:tc>
+        <w:tc>
+          <w:tcPr>
+            <w:tcW w:type="dxa" w:w="4320"/>
+          </w:tcPr>
+          <w:p>
+            <w:r>
+              <w:rPr>
+                <w:sz w:val="19"/>
+              </w:rPr>
+            </w:r>
+            <w:r>
+              <w:rPr>
+                <w:sz w:val="19"/>
+              </w:rPr>
+              <w:t xml:space="preserve">周期诊断（2 Hz 融合、心跳、帧率、触摸）由 </w:t>
+            </w:r>
+            <w:r>
+              <w:rPr>
+                <w:rFonts w:ascii="Consolas" w:hAnsi="Consolas"/>
+                <w:sz w:val="19"/>
+              </w:rPr>
+              <w:t>app_diag.h</w:t>
+            </w:r>
+            <w:r>
+              <w:rPr>
+                <w:sz w:val="19"/>
+              </w:rPr>
+              <w:t xml:space="preserve"> 的 </w:t>
+            </w:r>
+            <w:r>
+              <w:rPr>
+                <w:rFonts w:ascii="Consolas" w:hAnsi="Consolas"/>
+                <w:sz w:val="19"/>
+              </w:rPr>
+              <w:t>APP_DIAG_VERBOSE</w:t>
+            </w:r>
+            <w:r>
+              <w:rPr>
+                <w:sz w:val="19"/>
+              </w:rPr>
+              <w:t xml:space="preserve"> 编译开关控制，发布版静默</w:t>
+            </w:r>
+          </w:p>
+        </w:tc>
+      </w:tr>
     </w:tbl>
     <w:p>
       <w:pPr>

</xml_diff>

<commit_message>
docs: describe the v4 UI and the serial console findings
Signed-off-by: DingXu-hub <clonemeoutkm@gmail.com>
</commit_message>
<xml_diff>
--- a/作品介绍_contest2026_192_DX.docx
+++ b/作品介绍_contest2026_192_DX.docx
@@ -2570,6 +2570,167 @@
         <w:t>AI Coding 工具：用于方案调研、代码实现、问题定位与文档撰写（日志按大赛要求提交）。</w:t>
       </w:r>
     </w:p>
+    <w:p>
+      <w:pPr>
+        <w:pStyle w:val="Heading2"/>
+      </w:pPr>
+      <w:r>
+        <w:t>界面设计（UI v4.0，现代化改版）</w:t>
+      </w:r>
+    </w:p>
+    <w:p>
+      <w:pPr>
+        <w:pStyle w:val="ListBullet"/>
+      </w:pPr>
+      <w:r>
+        <w:rPr>
+          <w:b/>
+        </w:rPr>
+        <w:t>配色</w:t>
+      </w:r>
+      <w:r>
+        <w:t>：AMOLED 近黑底（#080B12）+ 石板灰卡片（#14181F，1px 发丝描边），每页一个饱和强调色——表盘青、跑步荧光绿、地图蓝、指南针青、统计紫、设置橙，形成"每屏一色"的视觉识别。</w:t>
+      </w:r>
+    </w:p>
+    <w:p>
+      <w:pPr>
+        <w:pStyle w:val="ListBullet"/>
+      </w:pPr>
+      <w:r>
+        <w:rPr>
+          <w:b/>
+        </w:rPr>
+        <w:t>字形</w:t>
+      </w:r>
+      <w:r>
+        <w:t>：自研</w:t>
+      </w:r>
+      <w:r>
+        <w:rPr>
+          <w:b/>
+        </w:rPr>
+        <w:t>圆润笔画数字</w:t>
+      </w:r>
+      <w:r>
+        <w:t>（7 段 + 两端半圆，任意高度矢量式绘制）替换原七段数码管；辅助文字统一 2×（10×14 px）并加 1.5 px 字距，形成现代无衬线观感。</w:t>
+      </w:r>
+    </w:p>
+    <w:p>
+      <w:pPr>
+        <w:pStyle w:val="ListBullet"/>
+      </w:pPr>
+      <w:r>
+        <w:rPr>
+          <w:b/>
+        </w:rPr>
+        <w:t>组件</w:t>
+      </w:r>
+      <w:r>
+        <w:t>：渐变进度弧（带圆头端点）、胶囊按钮/状态 pill、发丝描边卡片、主题色页指示器（活动页拉长胶囊）。</w:t>
+      </w:r>
+    </w:p>
+    <w:p>
+      <w:pPr>
+        <w:pStyle w:val="ListBullet"/>
+      </w:pPr>
+      <w:r>
+        <w:rPr>
+          <w:b/>
+        </w:rPr>
+        <w:t>页面</w:t>
+      </w:r>
+      <w:r>
+        <w:t>：</w:t>
+      </w:r>
+    </w:p>
+    <w:p>
+      <w:pPr>
+        <w:pStyle w:val="ListBullet"/>
+      </w:pPr>
+      <w:r>
+        <w:t>表盘：目标步数</w:t>
+      </w:r>
+      <w:r>
+        <w:rPr>
+          <w:b/>
+        </w:rPr>
+        <w:t>渐变弧环绕大时钟</w:t>
+      </w:r>
+      <w:r>
+        <w:t>，下方三列指标卡（步数 / km / kcal）</w:t>
+      </w:r>
+    </w:p>
+    <w:p>
+      <w:pPr>
+        <w:pStyle w:val="ListBullet"/>
+      </w:pPr>
+      <w:r>
+        <w:t>跑步：状态 pill + 大计时 + 距离（含目标进度条）与配速双卡 + 次级指标行 + 实心胶囊操作键</w:t>
+      </w:r>
+    </w:p>
+    <w:p>
+      <w:pPr>
+        <w:pStyle w:val="ListBullet"/>
+      </w:pPr>
+      <w:r>
+        <w:t>地图：地图全屏，顶部悬浮状态胶囊，底部"轻触复位"提示</w:t>
+      </w:r>
+    </w:p>
+    <w:p>
+      <w:pPr>
+        <w:pStyle w:val="ListBullet"/>
+      </w:pPr>
+      <w:r>
+        <w:t>指南针：5°/10°/30° 三级刻度环 + 强调色固定指针 + 圆润方位数字 + 风向玫瑰名</w:t>
+      </w:r>
+    </w:p>
+    <w:p>
+      <w:pPr>
+        <w:pStyle w:val="ListBullet"/>
+      </w:pPr>
+      <w:r>
+        <w:t>统计：三张汇总卡 + 最近记录列表</w:t>
+      </w:r>
+    </w:p>
+    <w:p>
+      <w:pPr>
+        <w:pStyle w:val="ListBullet"/>
+      </w:pPr>
+      <w:r>
+        <w:t>设置：四张可点卡片 + 关于卡片</w:t>
+      </w:r>
+    </w:p>
+    <w:p>
+      <w:pPr>
+        <w:pStyle w:val="ListBullet"/>
+      </w:pPr>
+      <w:r>
+        <w:rPr>
+          <w:b/>
+        </w:rPr>
+        <w:t>AI 通知卡片</w:t>
+      </w:r>
+      <w:r>
+        <w:t>：按文本自动 1–3 行向上生长，左侧强调色边条；</w:t>
+      </w:r>
+      <w:r>
+        <w:rPr>
+          <w:b/>
+        </w:rPr>
+        <w:t>轻触卡片即收起</w:t>
+      </w:r>
+      <w:r>
+        <w:t>，且不会穿透误触底部的停止按钮。</w:t>
+      </w:r>
+    </w:p>
+    <w:p>
+      <w:pPr>
+        <w:pStyle w:val="ListBullet"/>
+      </w:pPr>
+      <w:r>
+        <w:t>硬性约束全部保留：四角（R=56）零内容、底部宽元素 y≤390、无长按、翻页只用 KEY1/KEY2 短按、辅助文字 2×。</w:t>
+      </w:r>
+    </w:p>
     <w:sectPr>
       <w:pgSz w:w="12240" w:h="15840"/>
       <w:pgMar w:top="1440" w:right="1800" w:bottom="1440" w:left="1800" w:header="720" w:footer="720" w:gutter="0"/>

</xml_diff>

<commit_message>
docs: add the v4 UI screenshots captured on the device
Signed-off-by: DingXu-hub <clonemeoutkm@gmail.com>
</commit_message>
<xml_diff>
--- a/作品介绍_contest2026_192_DX.docx
+++ b/作品介绍_contest2026_192_DX.docx
@@ -2731,6 +2731,352 @@
         <w:t>硬性约束全部保留：四角（R=56）零内容、底部宽元素 y≤390、无长按、翻页只用 KEY1/KEY2 短按、辅助文字 2×。</w:t>
       </w:r>
     </w:p>
+    <w:p>
+      <w:pPr>
+        <w:pStyle w:val="Heading2"/>
+      </w:pPr>
+      <w:r>
+        <w:t>界面截图（v4.0 实机抓帧）</w:t>
+      </w:r>
+    </w:p>
+    <w:p>
+      <w:r>
+        <w:t xml:space="preserve">以下为本机（390×450 面板）实机抓帧，位于 </w:t>
+      </w:r>
+      <w:r>
+        <w:rPr>
+          <w:rFonts w:ascii="Consolas" w:hAnsi="Consolas"/>
+          <w:sz w:val="19"/>
+        </w:rPr>
+        <w:t>docs/images/</w:t>
+      </w:r>
+      <w:r>
+        <w:t>：</w:t>
+      </w:r>
+    </w:p>
+    <w:tbl>
+      <w:tblPr>
+        <w:tblStyle w:val="TableGrid"/>
+        <w:tblW w:type="auto" w:w="0"/>
+        <w:tblLook w:firstColumn="1" w:firstRow="1" w:lastColumn="0" w:lastRow="0" w:noHBand="0" w:noVBand="1" w:val="04A0"/>
+      </w:tblPr>
+      <w:tblGrid>
+        <w:gridCol w:w="2160"/>
+        <w:gridCol w:w="2160"/>
+        <w:gridCol w:w="2160"/>
+        <w:gridCol w:w="2160"/>
+      </w:tblGrid>
+      <w:tr>
+        <w:tc>
+          <w:tcPr>
+            <w:tcW w:type="dxa" w:w="2160"/>
+          </w:tcPr>
+          <w:p>
+            <w:r>
+              <w:rPr>
+                <w:b/>
+                <w:sz w:val="19"/>
+              </w:rPr>
+            </w:r>
+            <w:r>
+              <w:rPr>
+                <w:b/>
+                <w:sz w:val="19"/>
+              </w:rPr>
+              <w:t>页面</w:t>
+            </w:r>
+          </w:p>
+        </w:tc>
+        <w:tc>
+          <w:tcPr>
+            <w:tcW w:type="dxa" w:w="2160"/>
+          </w:tcPr>
+          <w:p>
+            <w:r>
+              <w:rPr>
+                <w:b/>
+                <w:sz w:val="19"/>
+              </w:rPr>
+            </w:r>
+            <w:r>
+              <w:rPr>
+                <w:b/>
+                <w:sz w:val="19"/>
+              </w:rPr>
+              <w:t>文件</w:t>
+            </w:r>
+          </w:p>
+        </w:tc>
+        <w:tc>
+          <w:tcPr>
+            <w:tcW w:type="dxa" w:w="2160"/>
+          </w:tcPr>
+          <w:p>
+            <w:r>
+              <w:rPr>
+                <w:b/>
+                <w:sz w:val="19"/>
+              </w:rPr>
+            </w:r>
+            <w:r>
+              <w:rPr>
+                <w:b/>
+                <w:sz w:val="19"/>
+              </w:rPr>
+              <w:t>页面</w:t>
+            </w:r>
+          </w:p>
+        </w:tc>
+        <w:tc>
+          <w:tcPr>
+            <w:tcW w:type="dxa" w:w="2160"/>
+          </w:tcPr>
+          <w:p>
+            <w:r>
+              <w:rPr>
+                <w:b/>
+                <w:sz w:val="19"/>
+              </w:rPr>
+            </w:r>
+            <w:r>
+              <w:rPr>
+                <w:b/>
+                <w:sz w:val="19"/>
+              </w:rPr>
+              <w:t>文件</w:t>
+            </w:r>
+          </w:p>
+        </w:tc>
+      </w:tr>
+      <w:tr>
+        <w:tc>
+          <w:tcPr>
+            <w:tcW w:type="dxa" w:w="2160"/>
+          </w:tcPr>
+          <w:p>
+            <w:r>
+              <w:rPr>
+                <w:sz w:val="19"/>
+              </w:rPr>
+            </w:r>
+            <w:r>
+              <w:rPr>
+                <w:sz w:val="19"/>
+              </w:rPr>
+              <w:t>表盘（步数弧 + 大时钟）</w:t>
+            </w:r>
+          </w:p>
+        </w:tc>
+        <w:tc>
+          <w:tcPr>
+            <w:tcW w:type="dxa" w:w="2160"/>
+          </w:tcPr>
+          <w:p>
+            <w:r>
+              <w:rPr>
+                <w:sz w:val="19"/>
+              </w:rPr>
+            </w:r>
+            <w:r>
+              <w:rPr>
+                <w:rFonts w:ascii="Consolas" w:hAnsi="Consolas"/>
+                <w:sz w:val="19"/>
+              </w:rPr>
+              <w:t>docs/images/ui-01-watch.png</w:t>
+            </w:r>
+          </w:p>
+        </w:tc>
+        <w:tc>
+          <w:tcPr>
+            <w:tcW w:type="dxa" w:w="2160"/>
+          </w:tcPr>
+          <w:p>
+            <w:r>
+              <w:rPr>
+                <w:sz w:val="19"/>
+              </w:rPr>
+            </w:r>
+            <w:r>
+              <w:rPr>
+                <w:sz w:val="19"/>
+              </w:rPr>
+              <w:t>指南针（三级刻度环）</w:t>
+            </w:r>
+          </w:p>
+        </w:tc>
+        <w:tc>
+          <w:tcPr>
+            <w:tcW w:type="dxa" w:w="2160"/>
+          </w:tcPr>
+          <w:p>
+            <w:r>
+              <w:rPr>
+                <w:sz w:val="19"/>
+              </w:rPr>
+            </w:r>
+            <w:r>
+              <w:rPr>
+                <w:rFonts w:ascii="Consolas" w:hAnsi="Consolas"/>
+                <w:sz w:val="19"/>
+              </w:rPr>
+              <w:t>docs/images/ui-04-compass.png</w:t>
+            </w:r>
+          </w:p>
+        </w:tc>
+      </w:tr>
+      <w:tr>
+        <w:tc>
+          <w:tcPr>
+            <w:tcW w:type="dxa" w:w="2160"/>
+          </w:tcPr>
+          <w:p>
+            <w:r>
+              <w:rPr>
+                <w:sz w:val="19"/>
+              </w:rPr>
+            </w:r>
+            <w:r>
+              <w:rPr>
+                <w:sz w:val="19"/>
+              </w:rPr>
+              <w:t>跑步（状态 pill + 双卡）</w:t>
+            </w:r>
+          </w:p>
+        </w:tc>
+        <w:tc>
+          <w:tcPr>
+            <w:tcW w:type="dxa" w:w="2160"/>
+          </w:tcPr>
+          <w:p>
+            <w:r>
+              <w:rPr>
+                <w:sz w:val="19"/>
+              </w:rPr>
+            </w:r>
+            <w:r>
+              <w:rPr>
+                <w:rFonts w:ascii="Consolas" w:hAnsi="Consolas"/>
+                <w:sz w:val="19"/>
+              </w:rPr>
+              <w:t>docs/images/ui-02-run.png</w:t>
+            </w:r>
+          </w:p>
+        </w:tc>
+        <w:tc>
+          <w:tcPr>
+            <w:tcW w:type="dxa" w:w="2160"/>
+          </w:tcPr>
+          <w:p>
+            <w:r>
+              <w:rPr>
+                <w:sz w:val="19"/>
+              </w:rPr>
+            </w:r>
+            <w:r>
+              <w:rPr>
+                <w:sz w:val="19"/>
+              </w:rPr>
+              <w:t>统计（汇总卡 + 记录）</w:t>
+            </w:r>
+          </w:p>
+        </w:tc>
+        <w:tc>
+          <w:tcPr>
+            <w:tcW w:type="dxa" w:w="2160"/>
+          </w:tcPr>
+          <w:p>
+            <w:r>
+              <w:rPr>
+                <w:sz w:val="19"/>
+              </w:rPr>
+            </w:r>
+            <w:r>
+              <w:rPr>
+                <w:rFonts w:ascii="Consolas" w:hAnsi="Consolas"/>
+                <w:sz w:val="19"/>
+              </w:rPr>
+              <w:t>docs/images/ui-05-stats.png</w:t>
+            </w:r>
+          </w:p>
+        </w:tc>
+      </w:tr>
+      <w:tr>
+        <w:tc>
+          <w:tcPr>
+            <w:tcW w:type="dxa" w:w="2160"/>
+          </w:tcPr>
+          <w:p>
+            <w:r>
+              <w:rPr>
+                <w:sz w:val="19"/>
+              </w:rPr>
+            </w:r>
+            <w:r>
+              <w:rPr>
+                <w:sz w:val="19"/>
+              </w:rPr>
+              <w:t>地图（悬浮胶囊）</w:t>
+            </w:r>
+          </w:p>
+        </w:tc>
+        <w:tc>
+          <w:tcPr>
+            <w:tcW w:type="dxa" w:w="2160"/>
+          </w:tcPr>
+          <w:p>
+            <w:r>
+              <w:rPr>
+                <w:sz w:val="19"/>
+              </w:rPr>
+            </w:r>
+            <w:r>
+              <w:rPr>
+                <w:rFonts w:ascii="Consolas" w:hAnsi="Consolas"/>
+                <w:sz w:val="19"/>
+              </w:rPr>
+              <w:t>docs/images/ui-03-map.png</w:t>
+            </w:r>
+          </w:p>
+        </w:tc>
+        <w:tc>
+          <w:tcPr>
+            <w:tcW w:type="dxa" w:w="2160"/>
+          </w:tcPr>
+          <w:p>
+            <w:r>
+              <w:rPr>
+                <w:sz w:val="19"/>
+              </w:rPr>
+            </w:r>
+            <w:r>
+              <w:rPr>
+                <w:sz w:val="19"/>
+              </w:rPr>
+              <w:t>设置（四卡 + 关于）</w:t>
+            </w:r>
+          </w:p>
+        </w:tc>
+        <w:tc>
+          <w:tcPr>
+            <w:tcW w:type="dxa" w:w="2160"/>
+          </w:tcPr>
+          <w:p>
+            <w:r>
+              <w:rPr>
+                <w:sz w:val="19"/>
+              </w:rPr>
+            </w:r>
+            <w:r>
+              <w:rPr>
+                <w:rFonts w:ascii="Consolas" w:hAnsi="Consolas"/>
+                <w:sz w:val="19"/>
+              </w:rPr>
+              <w:t>docs/images/ui-06-settings.png</w:t>
+            </w:r>
+          </w:p>
+        </w:tc>
+      </w:tr>
+    </w:tbl>
     <w:sectPr>
       <w:pgSz w:w="12240" w:h="15840"/>
       <w:pgMar w:top="1440" w:right="1800" w:bottom="1440" w:left="1800" w:header="720" w:footer="720" w:gutter="0"/>

</xml_diff>

<commit_message>
docs: record the submission checklist mapping and reproducibility in the project intro
Signed-off-by: DingXu-hub <clonemeoutkm@gmail.com>
</commit_message>
<xml_diff>
--- a/作品介绍_contest2026_192_DX.docx
+++ b/作品介绍_contest2026_192_DX.docx
@@ -3076,7 +3076,487 @@
           </w:p>
         </w:tc>
       </w:tr>
+      <w:tr>
+        <w:tc>
+          <w:tcPr>
+            <w:tcW w:type="dxa" w:w="2160"/>
+          </w:tcPr>
+          <w:p>
+            <w:r>
+              <w:rPr>
+                <w:sz w:val="19"/>
+              </w:rPr>
+            </w:r>
+            <w:r>
+              <w:rPr>
+                <w:b/>
+                <w:sz w:val="19"/>
+              </w:rPr>
+              <w:t>AI 通知卡片（3 行自动折行 + 轻触收起）</w:t>
+            </w:r>
+          </w:p>
+        </w:tc>
+        <w:tc>
+          <w:tcPr>
+            <w:tcW w:type="dxa" w:w="2160"/>
+          </w:tcPr>
+          <w:p>
+            <w:r>
+              <w:rPr>
+                <w:sz w:val="19"/>
+              </w:rPr>
+            </w:r>
+            <w:r>
+              <w:rPr>
+                <w:rFonts w:ascii="Consolas" w:hAnsi="Consolas"/>
+                <w:sz w:val="19"/>
+              </w:rPr>
+              <w:t>docs/images/ui-07-ai-card.png</w:t>
+            </w:r>
+          </w:p>
+        </w:tc>
+        <w:tc>
+          <w:tcPr>
+            <w:tcW w:type="dxa" w:w="2160"/>
+          </w:tcPr>
+          <w:p>
+            <w:r>
+              <w:rPr>
+                <w:sz w:val="19"/>
+              </w:rPr>
+            </w:r>
+          </w:p>
+        </w:tc>
+        <w:tc>
+          <w:tcPr>
+            <w:tcW w:type="dxa" w:w="2160"/>
+          </w:tcPr>
+          <w:p>
+            <w:r>
+              <w:rPr>
+                <w:sz w:val="19"/>
+              </w:rPr>
+            </w:r>
+          </w:p>
+        </w:tc>
+      </w:tr>
     </w:tbl>
+    <w:p>
+      <w:pPr>
+        <w:pStyle w:val="Heading2"/>
+      </w:pPr>
+      <w:r>
+        <w:t>提交材料与可复现性（对应大赛自查四条）</w:t>
+      </w:r>
+    </w:p>
+    <w:tbl>
+      <w:tblPr>
+        <w:tblStyle w:val="TableGrid"/>
+        <w:tblW w:type="auto" w:w="0"/>
+        <w:tblLook w:firstColumn="1" w:firstRow="1" w:lastColumn="0" w:lastRow="0" w:noHBand="0" w:noVBand="1" w:val="04A0"/>
+      </w:tblPr>
+      <w:tblGrid>
+        <w:gridCol w:w="4320"/>
+        <w:gridCol w:w="4320"/>
+      </w:tblGrid>
+      <w:tr>
+        <w:tc>
+          <w:tcPr>
+            <w:tcW w:type="dxa" w:w="4320"/>
+          </w:tcPr>
+          <w:p>
+            <w:r>
+              <w:rPr>
+                <w:b/>
+                <w:sz w:val="19"/>
+              </w:rPr>
+            </w:r>
+            <w:r>
+              <w:rPr>
+                <w:b/>
+                <w:sz w:val="19"/>
+              </w:rPr>
+              <w:t>自查项</w:t>
+            </w:r>
+          </w:p>
+        </w:tc>
+        <w:tc>
+          <w:tcPr>
+            <w:tcW w:type="dxa" w:w="4320"/>
+          </w:tcPr>
+          <w:p>
+            <w:r>
+              <w:rPr>
+                <w:b/>
+                <w:sz w:val="19"/>
+              </w:rPr>
+            </w:r>
+            <w:r>
+              <w:rPr>
+                <w:b/>
+                <w:sz w:val="19"/>
+              </w:rPr>
+              <w:t>本仓对应内容</w:t>
+            </w:r>
+          </w:p>
+        </w:tc>
+      </w:tr>
+      <w:tr>
+        <w:tc>
+          <w:tcPr>
+            <w:tcW w:type="dxa" w:w="4320"/>
+          </w:tcPr>
+          <w:p>
+            <w:r>
+              <w:rPr>
+                <w:sz w:val="19"/>
+              </w:rPr>
+            </w:r>
+            <w:r>
+              <w:rPr>
+                <w:sz w:val="19"/>
+              </w:rPr>
+              <w:t>① 技术报告</w:t>
+            </w:r>
+          </w:p>
+        </w:tc>
+        <w:tc>
+          <w:tcPr>
+            <w:tcW w:type="dxa" w:w="4320"/>
+          </w:tcPr>
+          <w:p>
+            <w:r>
+              <w:rPr>
+                <w:sz w:val="19"/>
+              </w:rPr>
+            </w:r>
+            <w:r>
+              <w:rPr>
+                <w:rFonts w:ascii="Consolas" w:hAnsi="Consolas"/>
+                <w:sz w:val="19"/>
+              </w:rPr>
+              <w:t>docs/技术报告-草稿.md</w:t>
+            </w:r>
+            <w:r>
+              <w:rPr>
+                <w:sz w:val="19"/>
+              </w:rPr>
+              <w:t>（按官方 3.1–3.7 结构撰写，待套官方 Word 模板）</w:t>
+            </w:r>
+          </w:p>
+        </w:tc>
+      </w:tr>
+      <w:tr>
+        <w:tc>
+          <w:tcPr>
+            <w:tcW w:type="dxa" w:w="4320"/>
+          </w:tcPr>
+          <w:p>
+            <w:r>
+              <w:rPr>
+                <w:sz w:val="19"/>
+              </w:rPr>
+            </w:r>
+            <w:r>
+              <w:rPr>
+                <w:sz w:val="19"/>
+              </w:rPr>
+              <w:t>② 源码（</w:t>
+            </w:r>
+            <w:r>
+              <w:rPr>
+                <w:rFonts w:ascii="Consolas" w:hAnsi="Consolas"/>
+                <w:sz w:val="19"/>
+              </w:rPr>
+              <w:t>dev-ai-contest-2026</w:t>
+            </w:r>
+            <w:r>
+              <w:rPr>
+                <w:sz w:val="19"/>
+              </w:rPr>
+              <w:t>）</w:t>
+            </w:r>
+          </w:p>
+        </w:tc>
+        <w:tc>
+          <w:tcPr>
+            <w:tcW w:type="dxa" w:w="4320"/>
+          </w:tcPr>
+          <w:p>
+            <w:r>
+              <w:rPr>
+                <w:sz w:val="19"/>
+              </w:rPr>
+            </w:r>
+            <w:r>
+              <w:rPr>
+                <w:rFonts w:ascii="Consolas" w:hAnsi="Consolas"/>
+                <w:sz w:val="19"/>
+              </w:rPr>
+              <w:t>app/hello_app/</w:t>
+            </w:r>
+            <w:r>
+              <w:rPr>
+                <w:sz w:val="19"/>
+              </w:rPr>
+              <w:t>（58 个文件，含 AI agent、链路层、Fusion、UI、磁校准）</w:t>
+            </w:r>
+          </w:p>
+        </w:tc>
+      </w:tr>
+      <w:tr>
+        <w:tc>
+          <w:tcPr>
+            <w:tcW w:type="dxa" w:w="4320"/>
+          </w:tcPr>
+          <w:p>
+            <w:r>
+              <w:rPr>
+                <w:sz w:val="19"/>
+              </w:rPr>
+            </w:r>
+            <w:r>
+              <w:rPr>
+                <w:sz w:val="19"/>
+              </w:rPr>
+              <w:t>② AI Coding 日志</w:t>
+            </w:r>
+          </w:p>
+        </w:tc>
+        <w:tc>
+          <w:tcPr>
+            <w:tcW w:type="dxa" w:w="4320"/>
+          </w:tcPr>
+          <w:p>
+            <w:r>
+              <w:rPr>
+                <w:sz w:val="19"/>
+              </w:rPr>
+            </w:r>
+            <w:r>
+              <w:rPr>
+                <w:rFonts w:ascii="Consolas" w:hAnsi="Consolas"/>
+                <w:sz w:val="19"/>
+              </w:rPr>
+              <w:t>logs/DingXu-Hub/</w:t>
+            </w:r>
+            <w:r>
+              <w:rPr>
+                <w:sz w:val="19"/>
+              </w:rPr>
+              <w:t>：</w:t>
+            </w:r>
+            <w:r>
+              <w:rPr>
+                <w:b/>
+                <w:sz w:val="19"/>
+              </w:rPr>
+              <w:t>5 个真实会话 / 217 事件</w:t>
+            </w:r>
+            <w:r>
+              <w:rPr>
+                <w:sz w:val="19"/>
+              </w:rPr>
+              <w:t>，官方采集器导出，</w:t>
+            </w:r>
+            <w:r>
+              <w:rPr>
+                <w:rFonts w:ascii="Consolas" w:hAnsi="Consolas"/>
+                <w:sz w:val="19"/>
+              </w:rPr>
+              <w:t>validate-log.py</w:t>
+            </w:r>
+            <w:r>
+              <w:rPr>
+                <w:sz w:val="19"/>
+              </w:rPr>
+              <w:t xml:space="preserve"> 校验 </w:t>
+            </w:r>
+            <w:r>
+              <w:rPr>
+                <w:b/>
+                <w:sz w:val="19"/>
+              </w:rPr>
+              <w:t>ALL OK</w:t>
+            </w:r>
+          </w:p>
+        </w:tc>
+      </w:tr>
+      <w:tr>
+        <w:tc>
+          <w:tcPr>
+            <w:tcW w:type="dxa" w:w="4320"/>
+          </w:tcPr>
+          <w:p>
+            <w:r>
+              <w:rPr>
+                <w:sz w:val="19"/>
+              </w:rPr>
+            </w:r>
+            <w:r>
+              <w:rPr>
+                <w:sz w:val="19"/>
+              </w:rPr>
+              <w:t>③ 自建 Skill</w:t>
+            </w:r>
+          </w:p>
+        </w:tc>
+        <w:tc>
+          <w:tcPr>
+            <w:tcW w:type="dxa" w:w="4320"/>
+          </w:tcPr>
+          <w:p>
+            <w:r>
+              <w:rPr>
+                <w:sz w:val="19"/>
+              </w:rPr>
+            </w:r>
+            <w:r>
+              <w:rPr>
+                <w:rFonts w:ascii="Consolas" w:hAnsi="Consolas"/>
+                <w:sz w:val="19"/>
+              </w:rPr>
+              <w:t>skills/huangshan-watch-dev/SKILL.md</w:t>
+            </w:r>
+            <w:r>
+              <w:rPr>
+                <w:sz w:val="19"/>
+              </w:rPr>
+              <w:t>（开发流水线 + 硬件拓扑 + 全部踩坑沉淀）</w:t>
+            </w:r>
+          </w:p>
+        </w:tc>
+      </w:tr>
+      <w:tr>
+        <w:tc>
+          <w:tcPr>
+            <w:tcW w:type="dxa" w:w="4320"/>
+          </w:tcPr>
+          <w:p>
+            <w:r>
+              <w:rPr>
+                <w:sz w:val="19"/>
+              </w:rPr>
+            </w:r>
+            <w:r>
+              <w:rPr>
+                <w:sz w:val="19"/>
+              </w:rPr>
+              <w:t>④ 真机证据</w:t>
+            </w:r>
+          </w:p>
+        </w:tc>
+        <w:tc>
+          <w:tcPr>
+            <w:tcW w:type="dxa" w:w="4320"/>
+          </w:tcPr>
+          <w:p>
+            <w:r>
+              <w:rPr>
+                <w:sz w:val="19"/>
+              </w:rPr>
+            </w:r>
+            <w:r>
+              <w:rPr>
+                <w:rFonts w:ascii="Consolas" w:hAnsi="Consolas"/>
+                <w:sz w:val="19"/>
+              </w:rPr>
+              <w:t>docs/evidence/</w:t>
+            </w:r>
+            <w:r>
+              <w:rPr>
+                <w:sz w:val="19"/>
+              </w:rPr>
+              <w:t>：实机截图 7 张、串口日志 4 份、测量数据（含</w:t>
+            </w:r>
+            <w:r>
+              <w:rPr>
+                <w:b/>
+                <w:sz w:val="19"/>
+              </w:rPr>
+              <w:t>测量方式与原始数据</w:t>
+            </w:r>
+            <w:r>
+              <w:rPr>
+                <w:sz w:val="19"/>
+              </w:rPr>
+              <w:t>）</w:t>
+            </w:r>
+          </w:p>
+        </w:tc>
+      </w:tr>
+    </w:tbl>
+    <w:p>
+      <w:r>
+        <w:rPr>
+          <w:b/>
+        </w:rPr>
+        <w:t>性能数据可复现</w:t>
+      </w:r>
+      <w:r>
+        <w:t>：</w:t>
+      </w:r>
+      <w:r>
+        <w:rPr>
+          <w:rFonts w:ascii="Consolas" w:hAnsi="Consolas"/>
+          <w:sz w:val="19"/>
+        </w:rPr>
+        <w:t>docs/evidence/measurements/README.md</w:t>
+      </w:r>
+      <w:r>
+        <w:t xml:space="preserve"> 给出每项数据的测量命令与日志；</w:t>
+      </w:r>
+    </w:p>
+    <w:p>
+      <w:r>
+        <w:t xml:space="preserve">磁校准可用 </w:t>
+      </w:r>
+      <w:r>
+        <w:rPr>
+          <w:rFonts w:ascii="Consolas" w:hAnsi="Consolas"/>
+          <w:sz w:val="19"/>
+        </w:rPr>
+        <w:t>tools/fit_mag_sphere.py</w:t>
+      </w:r>
+      <w:r>
+        <w:t xml:space="preserve"> 直接复跑（纯 stdlib）；链路可用 </w:t>
+      </w:r>
+      <w:r>
+        <w:rPr>
+          <w:rFonts w:ascii="Consolas" w:hAnsi="Consolas"/>
+          <w:sz w:val="19"/>
+        </w:rPr>
+        <w:t>tools/link_test.py</w:t>
+      </w:r>
+      <w:r>
+        <w:t>、</w:t>
+      </w:r>
+      <w:r>
+        <w:rPr>
+          <w:rFonts w:ascii="Consolas" w:hAnsi="Consolas"/>
+          <w:sz w:val="19"/>
+        </w:rPr>
+        <w:t>tools/gateway.py</w:t>
+      </w:r>
+      <w:r>
+        <w:t xml:space="preserve"> 复现；</w:t>
+      </w:r>
+    </w:p>
+    <w:p>
+      <w:r>
+        <w:t>其中 §2.1 如实记录了"两种球面拟合结果不一致"的排查过程与最终采信依据（硬件闭环证据：</w:t>
+      </w:r>
+      <w:r>
+        <w:rPr>
+          <w:rFonts w:ascii="Consolas" w:hAnsi="Consolas"/>
+          <w:sz w:val="19"/>
+        </w:rPr>
+        <w:t>em</w:t>
+      </w:r>
+      <w:r>
+        <w:t xml:space="preserve"> 90°→0–1°、\|B\| 朝向不变、半径=当地地磁总场）。</w:t>
+      </w:r>
+    </w:p>
     <w:sectPr>
       <w:pgSz w:w="12240" w:h="15840"/>
       <w:pgMar w:top="1440" w:right="1800" w:bottom="1440" w:left="1800" w:header="720" w:footer="720" w:gutter="0"/>

</xml_diff>